<commit_message>
Make the site easier to understand: short version, plain-English odds, simpler charts, FAQ
</commit_message>
<xml_diff>
--- a/docs/IPT_Analysis_Report.docx
+++ b/docs/IPT_Analysis_Report.docx
@@ -45,7 +45,7 @@
         <w:pStyle w:val="Heading1"/>
       </w:pPr>
       <w:r>
-        <w:t>1. Summary</w:t>
+        <w:t>1. The short version</w:t>
       </w:r>
     </w:p>
     <w:p>
@@ -57,10 +57,10 @@
         <w:rPr>
           <w:b/>
         </w:rPr>
-        <w:t xml:space="preserve">Ranking points are about to shrink sharply. </w:t>
+        <w:t xml:space="preserve">Most ranking points have an expiry date. </w:t>
       </w:r>
       <w:r>
-        <w:t>Everything counting today dates from 1 Jul 2025 or later. If the window resets on 1 Jul 2027, Aditya Jagtap keeps 888 of 4,168 points without new results; the men's top 5 keep between 11% and 32% of today's total.</w:t>
+        <w:t>If last season's points all drop off on 1 July 2027, No. 1 Aditya Jagtap keeps just 888 of his 4,168 points unless he wins more. The men's top 5 keep between 11% and 32% of what they have today.</w:t>
       </w:r>
     </w:p>
     <w:p>
@@ -72,10 +72,10 @@
         <w:rPr>
           <w:b/>
         </w:rPr>
-        <w:t xml:space="preserve">The 2026-27 season pays fewer points. </w:t>
+        <w:t xml:space="preserve">This season pays less. </w:t>
       </w:r>
       <w:r>
-        <w:t>A City Open win fell from 400 to 300 points and a quarter-final from 120 to 54. Top players cannot hold their totals even by repeating every 2025-26 result.</w:t>
+        <w:t>Winning a City Open now earns 300 points, down from 400; a quarter-final earns 54, down from 120. Repeating last season's results is no longer enough to keep the same total.</w:t>
       </w:r>
     </w:p>
     <w:p>
@@ -87,10 +87,10 @@
         <w:rPr>
           <w:b/>
         </w:rPr>
-        <w:t xml:space="preserve">The site does not apply its own "rolling 12 months" label. </w:t>
+        <w:t xml:space="preserve">The site's "12 months" label isn't what happens. </w:t>
       </w:r>
       <w:r>
-        <w:t>Under a strict 12-month rule, 12,512 points from Indian Padel Tour 7.0 and Kochi City Open would already have expired. Both rules are modelled.</w:t>
+        <w:t>If points really expired after 12 months, 12,512 points would already be gone. They still count, so this report shows both possible rules.</w:t>
       </w:r>
     </w:p>
     <w:p>
@@ -102,10 +102,10 @@
         <w:rPr>
           <w:b/>
         </w:rPr>
-        <w:t xml:space="preserve">Matches are fairly predictable from ranking points plus past games. </w:t>
+        <w:t xml:space="preserve">Matches are fairly predictable. </w:t>
       </w:r>
       <w:r>
-        <w:t>On two tournaments the model had never seen, it picked the winner 69% of the time, against 50% for a coin flip and 68% for points alone, and its stated confidence matched how often favourites actually won.</w:t>
+        <w:t>Our model called about 7 in 10 matches correctly on tournaments it had never seen (69%). Tossing a coin gets 5 in 10, and simply backing the higher-ranked pair gets 68%. The model's extra value is that its percentages can be trusted.</w:t>
       </w:r>
     </w:p>
     <w:p>
@@ -120,7 +120,73 @@
         <w:t xml:space="preserve">Chandigarh 2.0 favourites: </w:t>
       </w:r>
       <w:r>
-        <w:t>Aditya Jagtap / Rahul Motwani in Men's Advance (57% to win the title). The full odds for five divisions are in section 5 and on the website.</w:t>
+        <w:t>Aditya Jagtap &amp; Rahul Motwani in Men's Advance, with a 57% chance of winning the title (a bit better than a coin flip). Odds for five divisions are in section 5 and on the website.</w:t>
+      </w:r>
+    </w:p>
+    <w:p>
+      <w:pPr>
+        <w:pStyle w:val="Heading3"/>
+      </w:pPr>
+      <w:r>
+        <w:t>How IPT rankings work, in 30 seconds</w:t>
+      </w:r>
+    </w:p>
+    <w:p>
+      <w:pPr>
+        <w:pStyle w:val="ListBullet"/>
+        <w:spacing w:after="60"/>
+      </w:pPr>
+      <w:r>
+        <w:t>At every tournament, players earn ranking points depending on how far they get. Winning earns the most.</w:t>
+      </w:r>
+    </w:p>
+    <w:p>
+      <w:pPr>
+        <w:pStyle w:val="ListBullet"/>
+        <w:spacing w:after="60"/>
+      </w:pPr>
+      <w:r>
+        <w:t>Bigger events pay more: in the top division, winning a Grand Slam is worth 600 points and winning a City Open 300.</w:t>
+      </w:r>
+    </w:p>
+    <w:p>
+      <w:pPr>
+        <w:pStyle w:val="ListBullet"/>
+        <w:spacing w:after="60"/>
+      </w:pPr>
+      <w:r>
+        <w:t>Points don't last forever. After a while they drop off, and a player's ranking falls unless they win new ones.</w:t>
+      </w:r>
+    </w:p>
+    <w:p>
+      <w:pPr>
+        <w:pStyle w:val="ListBullet"/>
+        <w:spacing w:after="60"/>
+      </w:pPr>
+      <w:r>
+        <w:t>A player's ranking is simply the total of the points they still have.</w:t>
+      </w:r>
+    </w:p>
+    <w:p>
+      <w:pPr>
+        <w:pStyle w:val="Heading3"/>
+      </w:pPr>
+      <w:r>
+        <w:t>How to read the percentages</w:t>
+      </w:r>
+    </w:p>
+    <w:p>
+      <w:pPr>
+        <w:spacing w:after="120"/>
+      </w:pPr>
+      <w:r>
+        <w:rPr>
+          <w:b w:val="0"/>
+          <w:i w:val="0"/>
+          <w:color w:val="0B0B0B"/>
+          <w:sz w:val="21"/>
+        </w:rPr>
+        <w:t>A 57% chance means that if the same match were played 100 times, that pair would win about 57. Favourites still lose often. Words like "about 3 in 5" are used alongside percentages throughout. Technical terms are explained in the glossary at the end.</w:t>
       </w:r>
     </w:p>
     <w:p>
@@ -128,7 +194,7 @@
         <w:pStyle w:val="Heading1"/>
       </w:pPr>
       <w:r>
-        <w:t>2. Data and three things to know</w:t>
+        <w:t>2. Where the numbers come from</w:t>
       </w:r>
     </w:p>
     <w:p>
@@ -195,7 +261,7 @@
         <w:pStyle w:val="Heading1"/>
       </w:pPr>
       <w:r>
-        <w:t>3. Analysis 1: ranking forecast</w:t>
+        <w:t>3. Whose points are about to disappear?</w:t>
       </w:r>
     </w:p>
     <w:p>
@@ -8387,7 +8453,7 @@
         <w:pStyle w:val="Heading1"/>
       </w:pPr>
       <w:r>
-        <w:t>4. Analysis 2: how predictable are matches?</w:t>
+        <w:t>4. Can we predict who wins a match?</w:t>
       </w:r>
     </w:p>
     <w:p>
@@ -8478,7 +8544,7 @@
                 <w:color w:val="0B0B0B"/>
                 <w:sz w:val="17"/>
               </w:rPr>
-              <w:t>Model</w:t>
+              <w:t>Method</w:t>
             </w:r>
           </w:p>
         </w:tc>
@@ -8510,7 +8576,6 @@
           <w:p>
             <w:pPr>
               <w:spacing w:after="20" w:before="20"/>
-              <w:jc w:val="right"/>
             </w:pPr>
             <w:r>
               <w:rPr>
@@ -8518,7 +8583,7 @@
                 <w:color w:val="0B0B0B"/>
                 <w:sz w:val="17"/>
               </w:rPr>
-              <w:t>Correct</w:t>
+              <w:t>Called correctly</w:t>
             </w:r>
           </w:p>
         </w:tc>
@@ -8594,7 +8659,7 @@
                 <w:color w:val="0B0B0B"/>
                 <w:sz w:val="17"/>
               </w:rPr>
-              <w:t>coin flip</w:t>
+              <w:t>Toss a coin</w:t>
             </w:r>
           </w:p>
         </w:tc>
@@ -8623,7 +8688,6 @@
           <w:p>
             <w:pPr>
               <w:spacing w:after="20" w:before="20"/>
-              <w:jc w:val="right"/>
             </w:pPr>
             <w:r>
               <w:rPr>
@@ -8702,7 +8766,7 @@
                 <w:color w:val="0B0B0B"/>
                 <w:sz w:val="17"/>
               </w:rPr>
-              <w:t>points only</w:t>
+              <w:t>Back the higher-ranked pair</w:t>
             </w:r>
           </w:p>
         </w:tc>
@@ -8731,7 +8795,6 @@
           <w:p>
             <w:pPr>
               <w:spacing w:after="20" w:before="20"/>
-              <w:jc w:val="right"/>
             </w:pPr>
             <w:r>
               <w:rPr>
@@ -8810,7 +8873,7 @@
                 <w:color w:val="0B0B0B"/>
                 <w:sz w:val="17"/>
               </w:rPr>
-              <w:t>results only</w:t>
+              <w:t>Past games only</w:t>
             </w:r>
           </w:p>
         </w:tc>
@@ -8839,7 +8902,6 @@
           <w:p>
             <w:pPr>
               <w:spacing w:after="20" w:before="20"/>
-              <w:jc w:val="right"/>
             </w:pPr>
             <w:r>
               <w:rPr>
@@ -8918,7 +8980,7 @@
                 <w:color w:val="0B0B0B"/>
                 <w:sz w:val="17"/>
               </w:rPr>
-              <w:t>points + results</w:t>
+              <w:t>Our model</w:t>
             </w:r>
           </w:p>
         </w:tc>
@@ -8947,7 +9009,6 @@
           <w:p>
             <w:pPr>
               <w:spacing w:after="20" w:before="20"/>
-              <w:jc w:val="right"/>
             </w:pPr>
             <w:r>
               <w:rPr>
@@ -9026,7 +9087,7 @@
                 <w:color w:val="0B0B0B"/>
                 <w:sz w:val="17"/>
               </w:rPr>
-              <w:t>coin flip</w:t>
+              <w:t>Toss a coin</w:t>
             </w:r>
           </w:p>
         </w:tc>
@@ -9055,7 +9116,6 @@
           <w:p>
             <w:pPr>
               <w:spacing w:after="20" w:before="20"/>
-              <w:jc w:val="right"/>
             </w:pPr>
             <w:r>
               <w:rPr>
@@ -9134,7 +9194,7 @@
                 <w:color w:val="0B0B0B"/>
                 <w:sz w:val="17"/>
               </w:rPr>
-              <w:t>points only</w:t>
+              <w:t>Back the higher-ranked pair</w:t>
             </w:r>
           </w:p>
         </w:tc>
@@ -9163,7 +9223,6 @@
           <w:p>
             <w:pPr>
               <w:spacing w:after="20" w:before="20"/>
-              <w:jc w:val="right"/>
             </w:pPr>
             <w:r>
               <w:rPr>
@@ -9242,7 +9301,7 @@
                 <w:color w:val="0B0B0B"/>
                 <w:sz w:val="17"/>
               </w:rPr>
-              <w:t>results only</w:t>
+              <w:t>Past games only</w:t>
             </w:r>
           </w:p>
         </w:tc>
@@ -9271,7 +9330,6 @@
           <w:p>
             <w:pPr>
               <w:spacing w:after="20" w:before="20"/>
-              <w:jc w:val="right"/>
             </w:pPr>
             <w:r>
               <w:rPr>
@@ -9350,7 +9408,7 @@
                 <w:color w:val="0B0B0B"/>
                 <w:sz w:val="17"/>
               </w:rPr>
-              <w:t>points + results</w:t>
+              <w:t>Our model</w:t>
             </w:r>
           </w:p>
         </w:tc>
@@ -9379,7 +9437,6 @@
           <w:p>
             <w:pPr>
               <w:spacing w:after="20" w:before="20"/>
-              <w:jc w:val="right"/>
             </w:pPr>
             <w:r>
               <w:rPr>
@@ -9440,7 +9497,7 @@
           <w:color w:val="52514E"/>
           <w:sz w:val="19"/>
         </w:rPr>
-        <w:t>Log loss and Brier score measure how good the probabilities are (lower is better); "correct" only counts whether the favourite won. Ranking points carry most of the signal; learning from past games adds a smaller, consistent improvement.</w:t>
+        <w:t>"Called correctly" counts how often the favourite won. Log loss and Brier score (see the glossary) also reward honest percentages; lower is better. Ranking points carry most of the signal; learning from past games adds a smaller, consistent improvement.</w:t>
       </w:r>
     </w:p>
     <w:p>
@@ -9568,7 +9625,7 @@
         <w:pStyle w:val="Heading1"/>
       </w:pPr>
       <w:r>
-        <w:t>5. Analysis 3: City Open Chandigarh 2.0 forecast</w:t>
+        <w:t>5. Who will win City Open Chandigarh 2.0?</w:t>
       </w:r>
     </w:p>
     <w:p>
@@ -11293,6 +11350,545 @@
         <w:t>The Women's Intermediate and Advance combined format is not simulated.</w:t>
       </w:r>
     </w:p>
+    <w:p>
+      <w:pPr>
+        <w:pStyle w:val="Heading1"/>
+      </w:pPr>
+      <w:r>
+        <w:t>Glossary</w:t>
+      </w:r>
+    </w:p>
+    <w:tbl>
+      <w:tblPr>
+        <w:tblW w:type="auto" w:w="0"/>
+        <w:jc w:val="left"/>
+        <w:tblLayout w:type="fixed"/>
+        <w:tblLook w:firstColumn="1" w:firstRow="1" w:lastColumn="0" w:lastRow="0" w:noHBand="0" w:noVBand="1" w:val="04A0"/>
+        <w:tblBorders>
+          <w:top w:val="single" w:sz="4" w:color="D9D8D2"/>
+          <w:left w:val="nil" w:sz="4" w:color="D9D8D2"/>
+          <w:bottom w:val="single" w:sz="4" w:color="D9D8D2"/>
+          <w:right w:val="nil" w:sz="4" w:color="D9D8D2"/>
+          <w:insideH w:val="single" w:sz="4" w:color="D9D8D2"/>
+          <w:insideV w:val="nil" w:sz="4" w:color="D9D8D2"/>
+        </w:tblBorders>
+        <w:tblW w:w="9412" w:type="dxa"/>
+        <w:tblLayout w:type="fixed"/>
+      </w:tblPr>
+      <w:tblGrid>
+        <w:gridCol w:w="2494"/>
+        <w:gridCol w:w="6917"/>
+      </w:tblGrid>
+      <w:tr>
+        <w:tc>
+          <w:tcPr>
+            <w:tcW w:type="dxa" w:w="2494"/>
+            <w:shd w:val="clear" w:color="auto" w:fill="F0EFEC"/>
+          </w:tcPr>
+          <w:p>
+            <w:pPr>
+              <w:spacing w:after="20" w:before="20"/>
+            </w:pPr>
+            <w:r>
+              <w:rPr>
+                <w:b/>
+                <w:color w:val="0B0B0B"/>
+                <w:sz w:val="18"/>
+              </w:rPr>
+              <w:t>Term</w:t>
+            </w:r>
+          </w:p>
+        </w:tc>
+        <w:tc>
+          <w:tcPr>
+            <w:tcW w:type="dxa" w:w="6917"/>
+            <w:shd w:val="clear" w:color="auto" w:fill="F0EFEC"/>
+          </w:tcPr>
+          <w:p>
+            <w:pPr>
+              <w:spacing w:after="20" w:before="20"/>
+            </w:pPr>
+            <w:r>
+              <w:rPr>
+                <w:b/>
+                <w:color w:val="0B0B0B"/>
+                <w:sz w:val="18"/>
+              </w:rPr>
+              <w:t>Meaning</w:t>
+            </w:r>
+          </w:p>
+        </w:tc>
+      </w:tr>
+      <w:tr>
+        <w:tc>
+          <w:tcPr>
+            <w:tcW w:type="dxa" w:w="2494"/>
+          </w:tcPr>
+          <w:p>
+            <w:pPr>
+              <w:spacing w:after="20" w:before="20"/>
+            </w:pPr>
+            <w:r>
+              <w:rPr>
+                <w:color w:val="0B0B0B"/>
+                <w:sz w:val="18"/>
+              </w:rPr>
+              <w:t>Ranking points</w:t>
+            </w:r>
+          </w:p>
+        </w:tc>
+        <w:tc>
+          <w:tcPr>
+            <w:tcW w:type="dxa" w:w="6917"/>
+          </w:tcPr>
+          <w:p>
+            <w:pPr>
+              <w:spacing w:after="20" w:before="20"/>
+            </w:pPr>
+            <w:r>
+              <w:rPr>
+                <w:color w:val="0B0B0B"/>
+                <w:sz w:val="18"/>
+              </w:rPr>
+              <w:t>Points earned for how far a player gets at a tournament. A player's ranking is the total that still counts.</w:t>
+            </w:r>
+          </w:p>
+        </w:tc>
+      </w:tr>
+      <w:tr>
+        <w:tc>
+          <w:tcPr>
+            <w:tcW w:type="dxa" w:w="2494"/>
+          </w:tcPr>
+          <w:p>
+            <w:pPr>
+              <w:spacing w:after="20" w:before="20"/>
+            </w:pPr>
+            <w:r>
+              <w:rPr>
+                <w:color w:val="0B0B0B"/>
+                <w:sz w:val="18"/>
+              </w:rPr>
+              <w:t>Grand Slam, City Open</w:t>
+            </w:r>
+          </w:p>
+        </w:tc>
+        <w:tc>
+          <w:tcPr>
+            <w:tcW w:type="dxa" w:w="6917"/>
+          </w:tcPr>
+          <w:p>
+            <w:pPr>
+              <w:spacing w:after="20" w:before="20"/>
+            </w:pPr>
+            <w:r>
+              <w:rPr>
+                <w:color w:val="0B0B0B"/>
+                <w:sz w:val="18"/>
+              </w:rPr>
+              <w:t>The two tournament tiers. Grand Slams pay more points than City Opens.</w:t>
+            </w:r>
+          </w:p>
+        </w:tc>
+      </w:tr>
+      <w:tr>
+        <w:tc>
+          <w:tcPr>
+            <w:tcW w:type="dxa" w:w="2494"/>
+          </w:tcPr>
+          <w:p>
+            <w:pPr>
+              <w:spacing w:after="20" w:before="20"/>
+            </w:pPr>
+            <w:r>
+              <w:rPr>
+                <w:color w:val="0B0B0B"/>
+                <w:sz w:val="18"/>
+              </w:rPr>
+              <w:t>Division</w:t>
+            </w:r>
+          </w:p>
+        </w:tc>
+        <w:tc>
+          <w:tcPr>
+            <w:tcW w:type="dxa" w:w="6917"/>
+          </w:tcPr>
+          <w:p>
+            <w:pPr>
+              <w:spacing w:after="20" w:before="20"/>
+            </w:pPr>
+            <w:r>
+              <w:rPr>
+                <w:color w:val="0B0B0B"/>
+                <w:sz w:val="18"/>
+              </w:rPr>
+              <w:t>The level a pair plays at: Beginner, Intermediate, Advance (top) or 40+. Each division has its own draw and points.</w:t>
+            </w:r>
+          </w:p>
+        </w:tc>
+      </w:tr>
+      <w:tr>
+        <w:tc>
+          <w:tcPr>
+            <w:tcW w:type="dxa" w:w="2494"/>
+          </w:tcPr>
+          <w:p>
+            <w:pPr>
+              <w:spacing w:after="20" w:before="20"/>
+            </w:pPr>
+            <w:r>
+              <w:rPr>
+                <w:color w:val="0B0B0B"/>
+                <w:sz w:val="18"/>
+              </w:rPr>
+              <w:t>Expiry, window</w:t>
+            </w:r>
+          </w:p>
+        </w:tc>
+        <w:tc>
+          <w:tcPr>
+            <w:tcW w:type="dxa" w:w="6917"/>
+          </w:tcPr>
+          <w:p>
+            <w:pPr>
+              <w:spacing w:after="20" w:before="20"/>
+            </w:pPr>
+            <w:r>
+              <w:rPr>
+                <w:color w:val="0B0B0B"/>
+                <w:sz w:val="18"/>
+              </w:rPr>
+              <w:t>Points only count for a limited time. The window is the period whose points still count.</w:t>
+            </w:r>
+          </w:p>
+        </w:tc>
+      </w:tr>
+      <w:tr>
+        <w:tc>
+          <w:tcPr>
+            <w:tcW w:type="dxa" w:w="2494"/>
+          </w:tcPr>
+          <w:p>
+            <w:pPr>
+              <w:spacing w:after="20" w:before="20"/>
+            </w:pPr>
+            <w:r>
+              <w:rPr>
+                <w:color w:val="0B0B0B"/>
+                <w:sz w:val="18"/>
+              </w:rPr>
+              <w:t>Race to 8</w:t>
+            </w:r>
+          </w:p>
+        </w:tc>
+        <w:tc>
+          <w:tcPr>
+            <w:tcW w:type="dxa" w:w="6917"/>
+          </w:tcPr>
+          <w:p>
+            <w:pPr>
+              <w:spacing w:after="20" w:before="20"/>
+            </w:pPr>
+            <w:r>
+              <w:rPr>
+                <w:color w:val="0B0B0B"/>
+                <w:sz w:val="18"/>
+              </w:rPr>
+              <w:t>The usual match format: the first pair to win 8 games wins the match.</w:t>
+            </w:r>
+          </w:p>
+        </w:tc>
+      </w:tr>
+      <w:tr>
+        <w:tc>
+          <w:tcPr>
+            <w:tcW w:type="dxa" w:w="2494"/>
+          </w:tcPr>
+          <w:p>
+            <w:pPr>
+              <w:spacing w:after="20" w:before="20"/>
+            </w:pPr>
+            <w:r>
+              <w:rPr>
+                <w:color w:val="0B0B0B"/>
+                <w:sz w:val="18"/>
+              </w:rPr>
+              <w:t>Model</w:t>
+            </w:r>
+          </w:p>
+        </w:tc>
+        <w:tc>
+          <w:tcPr>
+            <w:tcW w:type="dxa" w:w="6917"/>
+          </w:tcPr>
+          <w:p>
+            <w:pPr>
+              <w:spacing w:after="20" w:before="20"/>
+            </w:pPr>
+            <w:r>
+              <w:rPr>
+                <w:color w:val="0B0B0B"/>
+                <w:sz w:val="18"/>
+              </w:rPr>
+              <w:t>A set of rules, learned from past results, that turns ranking points and past games into a chance of winning.</w:t>
+            </w:r>
+          </w:p>
+        </w:tc>
+      </w:tr>
+      <w:tr>
+        <w:tc>
+          <w:tcPr>
+            <w:tcW w:type="dxa" w:w="2494"/>
+          </w:tcPr>
+          <w:p>
+            <w:pPr>
+              <w:spacing w:after="20" w:before="20"/>
+            </w:pPr>
+            <w:r>
+              <w:rPr>
+                <w:color w:val="0B0B0B"/>
+                <w:sz w:val="18"/>
+              </w:rPr>
+              <w:t>Tested on unseen tournaments</w:t>
+            </w:r>
+          </w:p>
+        </w:tc>
+        <w:tc>
+          <w:tcPr>
+            <w:tcW w:type="dxa" w:w="6917"/>
+          </w:tcPr>
+          <w:p>
+            <w:pPr>
+              <w:spacing w:after="20" w:before="20"/>
+            </w:pPr>
+            <w:r>
+              <w:rPr>
+                <w:color w:val="0B0B0B"/>
+                <w:sz w:val="18"/>
+              </w:rPr>
+              <w:t>The model was scored only on tournaments it had not learned from, so the test is fair.</w:t>
+            </w:r>
+          </w:p>
+        </w:tc>
+      </w:tr>
+      <w:tr>
+        <w:tc>
+          <w:tcPr>
+            <w:tcW w:type="dxa" w:w="2494"/>
+          </w:tcPr>
+          <w:p>
+            <w:pPr>
+              <w:spacing w:after="20" w:before="20"/>
+            </w:pPr>
+            <w:r>
+              <w:rPr>
+                <w:color w:val="0B0B0B"/>
+                <w:sz w:val="18"/>
+              </w:rPr>
+              <w:t>Honest percentages (calibration)</w:t>
+            </w:r>
+          </w:p>
+        </w:tc>
+        <w:tc>
+          <w:tcPr>
+            <w:tcW w:type="dxa" w:w="6917"/>
+          </w:tcPr>
+          <w:p>
+            <w:pPr>
+              <w:spacing w:after="20" w:before="20"/>
+            </w:pPr>
+            <w:r>
+              <w:rPr>
+                <w:color w:val="0B0B0B"/>
+                <w:sz w:val="18"/>
+              </w:rPr>
+              <w:t>When the model says 70%, the favourite should win about 70 times in 100. The model passes this check.</w:t>
+            </w:r>
+          </w:p>
+        </w:tc>
+      </w:tr>
+      <w:tr>
+        <w:tc>
+          <w:tcPr>
+            <w:tcW w:type="dxa" w:w="2494"/>
+          </w:tcPr>
+          <w:p>
+            <w:pPr>
+              <w:spacing w:after="20" w:before="20"/>
+            </w:pPr>
+            <w:r>
+              <w:rPr>
+                <w:color w:val="0B0B0B"/>
+                <w:sz w:val="18"/>
+              </w:rPr>
+              <w:t>Log loss</w:t>
+            </w:r>
+          </w:p>
+        </w:tc>
+        <w:tc>
+          <w:tcPr>
+            <w:tcW w:type="dxa" w:w="6917"/>
+          </w:tcPr>
+          <w:p>
+            <w:pPr>
+              <w:spacing w:after="20" w:before="20"/>
+            </w:pPr>
+            <w:r>
+              <w:rPr>
+                <w:color w:val="0B0B0B"/>
+                <w:sz w:val="18"/>
+              </w:rPr>
+              <w:t>A score for the quality of predicted percentages. It punishes confident wrong calls hard. Lower is better; a coin flip scores 0.693.</w:t>
+            </w:r>
+          </w:p>
+        </w:tc>
+      </w:tr>
+      <w:tr>
+        <w:tc>
+          <w:tcPr>
+            <w:tcW w:type="dxa" w:w="2494"/>
+          </w:tcPr>
+          <w:p>
+            <w:pPr>
+              <w:spacing w:after="20" w:before="20"/>
+            </w:pPr>
+            <w:r>
+              <w:rPr>
+                <w:color w:val="0B0B0B"/>
+                <w:sz w:val="18"/>
+              </w:rPr>
+              <w:t>Brier score</w:t>
+            </w:r>
+          </w:p>
+        </w:tc>
+        <w:tc>
+          <w:tcPr>
+            <w:tcW w:type="dxa" w:w="6917"/>
+          </w:tcPr>
+          <w:p>
+            <w:pPr>
+              <w:spacing w:after="20" w:before="20"/>
+            </w:pPr>
+            <w:r>
+              <w:rPr>
+                <w:color w:val="0B0B0B"/>
+                <w:sz w:val="18"/>
+              </w:rPr>
+              <w:t>Another score for percentages: the average squared gap between the prediction and what happened. Lower is better; a coin flip scores 0.250.</w:t>
+            </w:r>
+          </w:p>
+        </w:tc>
+      </w:tr>
+      <w:tr>
+        <w:tc>
+          <w:tcPr>
+            <w:tcW w:type="dxa" w:w="2494"/>
+          </w:tcPr>
+          <w:p>
+            <w:pPr>
+              <w:spacing w:after="20" w:before="20"/>
+            </w:pPr>
+            <w:r>
+              <w:rPr>
+                <w:color w:val="0B0B0B"/>
+                <w:sz w:val="18"/>
+              </w:rPr>
+              <w:t>Simulation</w:t>
+            </w:r>
+          </w:p>
+        </w:tc>
+        <w:tc>
+          <w:tcPr>
+            <w:tcW w:type="dxa" w:w="6917"/>
+          </w:tcPr>
+          <w:p>
+            <w:pPr>
+              <w:spacing w:after="20" w:before="20"/>
+            </w:pPr>
+            <w:r>
+              <w:rPr>
+                <w:color w:val="0B0B0B"/>
+                <w:sz w:val="18"/>
+              </w:rPr>
+              <w:t>Playing out the rest of a tournament many times on a computer, using the model's chances for each match, and counting how often each team wins.</w:t>
+            </w:r>
+          </w:p>
+        </w:tc>
+      </w:tr>
+      <w:tr>
+        <w:tc>
+          <w:tcPr>
+            <w:tcW w:type="dxa" w:w="2494"/>
+          </w:tcPr>
+          <w:p>
+            <w:pPr>
+              <w:spacing w:after="20" w:before="20"/>
+            </w:pPr>
+            <w:r>
+              <w:rPr>
+                <w:color w:val="0B0B0B"/>
+                <w:sz w:val="18"/>
+              </w:rPr>
+              <w:t>Toss-up, favourite</w:t>
+            </w:r>
+          </w:p>
+        </w:tc>
+        <w:tc>
+          <w:tcPr>
+            <w:tcW w:type="dxa" w:w="6917"/>
+          </w:tcPr>
+          <w:p>
+            <w:pPr>
+              <w:spacing w:after="20" w:before="20"/>
+            </w:pPr>
+            <w:r>
+              <w:rPr>
+                <w:color w:val="0B0B0B"/>
+                <w:sz w:val="18"/>
+              </w:rPr>
+              <w:t>Toss-up: no clear favourite (below 55%). Slight favourite 55-65%, favourite 65-80%, strong favourite above 80%.</w:t>
+            </w:r>
+          </w:p>
+        </w:tc>
+      </w:tr>
+      <w:tr>
+        <w:tc>
+          <w:tcPr>
+            <w:tcW w:type="dxa" w:w="2494"/>
+          </w:tcPr>
+          <w:p>
+            <w:pPr>
+              <w:spacing w:after="20" w:before="20"/>
+            </w:pPr>
+            <w:r>
+              <w:rPr>
+                <w:color w:val="0B0B0B"/>
+                <w:sz w:val="18"/>
+              </w:rPr>
+              <w:t>Walkover</w:t>
+            </w:r>
+          </w:p>
+        </w:tc>
+        <w:tc>
+          <w:tcPr>
+            <w:tcW w:type="dxa" w:w="6917"/>
+          </w:tcPr>
+          <w:p>
+            <w:pPr>
+              <w:spacing w:after="20" w:before="20"/>
+            </w:pPr>
+            <w:r>
+              <w:rPr>
+                <w:color w:val="0B0B0B"/>
+                <w:sz w:val="18"/>
+              </w:rPr>
+              <w:t>A match won without being played. Left out of the model.</w:t>
+            </w:r>
+          </w:p>
+        </w:tc>
+      </w:tr>
+    </w:tbl>
+    <w:p/>
     <w:p>
       <w:pPr>
         <w:pStyle w:val="Heading1"/>

</xml_diff>